<commit_message>
Tribune Dutreil v9 finale : dernier « on » remplacé, en-têtes allégés
Co-Authored-By: Claude Fable 5 <noreply@anthropic.com>
Claude-Session: https://claude.ai/code/session_01EismpbntstLAG4woJnWJbX
</commit_message>
<xml_diff>
--- a/livrables/Tribune-Dutreil-Carrez/Tribune-Dutreil_Version-longue_5000-signes.docx
+++ b/livrables/Tribune-Dutreil-Carrez/Tribune-Dutreil_Version-longue_5000-signes.docx
@@ -18,7 +18,7 @@
           <w:sz w:val="18"/>
           <w:szCs w:val="18"/>
         </w:rPr>
-        <w:t xml:space="preserve">Projet de tribune, cosignature Gilles Carrez / François Ouairy. Version longue ~5 500 signes (le chapô sera rédigé par la rédaction). Les passages entre crochets sont à votre main. Version 9 du 4 septembre 2026.</w:t>
+        <w:t xml:space="preserve">Projet de tribune, cosignature Gilles Carrez / François Ouairy. Version longue (le chapô sera rédigé par la rédaction). Les passages entre crochets sont à votre main. Version 9 du 4 septembre 2026.</w:t>
       </w:r>
     </w:p>
     <w:p>
@@ -170,7 +170,7 @@
           <w:sz w:val="24"/>
           <w:szCs w:val="24"/>
         </w:rPr>
-        <w:t xml:space="preserve">Reste l'objection d'équité, et elle pèse. Une exonération dont 1 % des bénéficiaires capte les deux tiers interroge le consentement à l'impôt, au moment où chacun est appelé à l'effort. Le rabot uniforme y répond mal. Un plafonnement brutal frapperait d'abord les entreprises moyennes, dont les héritiers n'ont ni la trésorerie pour payer ni l'ingénierie pour s'organiser, quand les très grands patrimoines ont du temps et des conseils pour s'adapter. L'Allemagne exonère l'outil de travail jusqu'à 100 %, contre des engagements contrôlés de maintien de l'emploi. On aimerait que l'automne budgétaire porte sur ce genre de contreparties. Il portera, sauf surprise, sur le taux.</w:t>
+        <w:t xml:space="preserve">Reste l'objection d'équité, et elle pèse. Une exonération dont 1 % des bénéficiaires capte les deux tiers interroge le consentement à l'impôt, au moment où chacun est appelé à l'effort. Le rabot uniforme y répond mal. Un plafonnement brutal frapperait d'abord les entreprises moyennes, dont les héritiers n'ont ni la trésorerie pour payer ni l'ingénierie pour s'organiser, quand les très grands patrimoines ont du temps et des conseils pour s'adapter. L'Allemagne exonère l'outil de travail jusqu'à 100 %, contre des engagements contrôlés de maintien de l'emploi. Nous aimerions que l'automne budgétaire porte sur ce genre de contreparties. Il portera, sauf surprise, sur le taux.</w:t>
       </w:r>
     </w:p>
     <w:p>

</xml_diff>